<commit_message>
Index update after crash
Index update after crash
</commit_message>
<xml_diff>
--- a/Manus/Intervjuer/Intervjuer Violent vision och Swegore.docx
+++ b/Manus/Intervjuer/Intervjuer Violent vision och Swegore.docx
@@ -897,6 +897,11 @@
       </w:r>
     </w:p>
     <w:p>
+      <w:pPr>
+        <w:rPr>
+          <w:lang w:val="en-GB"/>
+        </w:rPr>
+      </w:pPr>
       <w:r>
         <w:rPr>
           <w:lang w:val="en-GB"/>
@@ -904,53 +909,99 @@
         <w:t xml:space="preserve">I have always been interested in the way modern mythologies have been spread (and sometimes created) by popular cinema, and to my generation (I am 54) Scandinavian cinema had a huge impact. </w:t>
       </w:r>
       <w:r>
+        <w:rPr>
+          <w:lang w:val="en-GB"/>
+        </w:rPr>
         <w:t>In SCADINAVIAN BLUE a Danish journalist comments that the movie CHRISTA could only have been made by a foreigner and perhaps the same is true of my book which is really as much about America as Denmark or Sweden. The fact that I have lived in Denmark for 17 years (after marrying a Danish girl) as allowed me to understand the story on a deeper level. In a practical sense it was the story I could write because I lived here and know the language and culture relatively speaking. But also as I say a story I was personally interested in. I remember as a teenager all the rumors about the film I AM CURIOUS YELLOW that swept the small town I was living in. To young men in America in the late 60s Sweden and Denmark were indeed mytological places. The sexual revolution happened there first, these countries entered the future first.</w:t>
       </w:r>
     </w:p>
     <w:p>
+      <w:pPr>
+        <w:rPr>
+          <w:lang w:val="en-GB"/>
+        </w:rPr>
+      </w:pPr>
       <w:r>
         <w:rPr>
           <w:b/>
           <w:bCs/>
+          <w:lang w:val="en-GB"/>
         </w:rPr>
         <w:t>Can you tell us a little about the film shows that you´re showing at festivals? What kind of themes do they have, and what are the reactions from the audience?</w:t>
       </w:r>
     </w:p>
     <w:p>
-      <w:r>
+      <w:pPr>
+        <w:rPr>
+          <w:lang w:val="en-GB"/>
+        </w:rPr>
+      </w:pPr>
+      <w:r>
+        <w:rPr>
+          <w:lang w:val="en-GB"/>
+        </w:rPr>
         <w:t>I have written the book over the course of 7 years and for 4 years I have been lecturing on the subject at film festivals in Europe and America, screening a selection of feature films, trailers and outtakes that outline the evolution of Danish and Swedish erotic cinema from the 50s into the 70s. The feature films include ADVENTURE IN DENMARK, WITHOUT A STITCH and other movies.</w:t>
       </w:r>
     </w:p>
     <w:p>
+      <w:pPr>
+        <w:rPr>
+          <w:lang w:val="en-GB"/>
+        </w:rPr>
+      </w:pPr>
       <w:r>
         <w:rPr>
           <w:b/>
           <w:bCs/>
+          <w:lang w:val="en-GB"/>
         </w:rPr>
         <w:t>If you got to choose one Danish and one Swedish film that really embodies the Scandinavian sin, which ones would that be?</w:t>
       </w:r>
     </w:p>
     <w:p>
-      <w:r>
+      <w:pPr>
+        <w:rPr>
+          <w:lang w:val="en-GB"/>
+        </w:rPr>
+      </w:pPr>
+      <w:r>
+        <w:rPr>
+          <w:lang w:val="en-GB"/>
+        </w:rPr>
         <w:t xml:space="preserve">That is a difficult question because one must define the term SIN and that is in the eye of the beholder and depends on the era. Is hardcore XXX pornography sin or not? For example I A WOMAN was far more daring and shocking film for audiences of the time than the hardcore pornographic films that came out later. And what is perhaps the sickest film, THE SINFUL DWARF was not even particularly Danish. THRILLER, A CRUEL PICTURE, the sickest movie produced in in Sweden was also not particularly Swedish. It was the obsession of one individual. So I really have trouble coming up with single films that embody the two countries. When people talk about the concept of SIN in movies I </w:t>
       </w:r>
       <w:r>
+        <w:rPr>
+          <w:lang w:val="en-GB"/>
+        </w:rPr>
         <w:lastRenderedPageBreak/>
         <w:t>always think of the Liz Taylor movie BUTTERFIELD 8 which is far more sinful than DEEP THROAT.</w:t>
       </w:r>
     </w:p>
     <w:p>
+      <w:pPr>
+        <w:rPr>
+          <w:lang w:val="en-GB"/>
+        </w:rPr>
+      </w:pPr>
       <w:r>
         <w:rPr>
           <w:b/>
           <w:bCs/>
+          <w:lang w:val="en-GB"/>
         </w:rPr>
         <w:t>The kind of films that you write about is not the newer bunch of movies that you easily can get hold of. Aren´t there any new films that rises your interest?</w:t>
       </w:r>
     </w:p>
     <w:p>
       <w:r>
-        <w:t>I am not a great fan of the newer films which can all be said to be art films. I am more a fan of what could broadly be called exploitation cinema and the 50s through the 70s was the golden age of Scandinavian exploitation cinema. It ended at the start of the 80s. I am simply not much interested in mainstream commercial cinema today - or art house cinema. The selection of films one can see in movie theaters today is very narrow, but on the other hand I never watch films on DVD except for research purposes. And I do not go to film festivals unless I am invited to show one of my programs. I am out of the loop and happy to be there.</w:t>
+        <w:rPr>
+          <w:lang w:val="en-GB"/>
+        </w:rPr>
+        <w:t xml:space="preserve">I am not a great fan of the newer films which can all be said to be art films. I am more a fan of what could broadly be called exploitation cinema and the 50s through the 70s was the golden age of Scandinavian exploitation cinema. It ended at the start of the 80s. I am simply not much interested in mainstream commercial cinema today - or art house cinema. The selection of films one can see in movie theaters today is very narrow, but on the other hand I never watch films on DVD except for research purposes. And I do not go to film festivals unless I am invited to show one of my programs. </w:t>
+      </w:r>
+      <w:r>
+        <w:t>I am out of the loop and happy to be there.</w:t>
       </w:r>
     </w:p>
     <w:p/>

</xml_diff>